<commit_message>
Add end-to-end pipeline with synthetic demo data (D98)
</commit_message>
<xml_diff>
--- a/1_Code/Experiment/exp_matlab/主试培训手册_Exp_Design_Formal.docx
+++ b/1_Code/Experiment/exp_matlab/主试培训手册_Exp_Design_Formal.docx
@@ -14,7 +14,7 @@
           <w:i/>
           <w:color w:val="595959"/>
         </w:rPr>
-        <w:t xml:space="preserve">适用程序：`1_Code/Experiment/exp_matlab/Exp_Design_Formal.m`（v4.8）</w:t>
+        <w:t xml:space="preserve">适用程序：`1_Code/Experiment/exp_matlab/Exp_Design_Formal.m`（v4.9）</w:t>
       </w:r>
     </w:p>
     <w:p>
@@ -23,7 +23,7 @@
           <w:i/>
           <w:color w:val="595959"/>
         </w:rPr>
-        <w:t xml:space="preserve">版本：v2.7（2026-10-18，v2.7 把六条自测改成路径无关的 `test\run_selftest.bat`、补 §7.w「把整个文件夹拷到实验室机」并对应程序 v4.8；v2.6 补「指导语一闪而过」症状与 v4.7 松键门槛；v2.5 补「onset 之前的按键」症状与 v4.6；v2.4 随 D4 设计定稿 + 程序 v4.5；v2.1 补第 3.2 节自测；v2.2 增至四条并补 6.6 已知崩溃症状；v2.3 增至六条并加「整场冒烟」，对应程序 v4.5；v2.4 把刷新率从「≥ 60 Hz」收紧为**必须 60.004 Hz**、并补 §7 的「高刷屏症状」与 §8 的 Word 版生成办法。上一版 v1.2 还是旧的「9 条件」设计）｜培训对象：所有参与正式采集的主试</w:t>
+        <w:t xml:space="preserve">版本：v2.8（2026-10-18，v2.8 把练习段口径改成 `max(4, P)`——组 1 也有 4 个兜底练习——并对应程序 v4.9；v2.7 把六条自测改成路径无关的 `test\run_selftest.bat`、补 §7.w「把整个文件夹拷到实验室机」并对应程序 v4.8；v2.6 补「指导语一闪而过」症状与 v4.7 松键门槛；v2.5 补「onset 之前的按键」症状与 v4.6；v2.4 随 D4 设计定稿 + 程序 v4.5；v2.1 补第 3.2 节自测；v2.2 增至四条并补 6.6 已知崩溃症状；v2.3 增至六条并加「整场冒烟」，对应程序 v4.5；v2.4 把刷新率从「≥ 60 Hz」收紧为**必须 60.004 Hz**、并补 §7 的「高刷屏症状」与 §8 的 Word 版生成办法。上一版 v1.2 还是旧的「9 条件」设计）｜培训对象：所有参与正式采集的主试</w:t>
       </w:r>
     </w:p>
     <w:p>
@@ -156,7 +156,7 @@
               <w:rPr>
                 <w:b/>
               </w:rPr>
-              <w:t xml:space="preserve">P（额外练习试次）</w:t>
+              <w:t xml:space="preserve">P（组参数）⇒ 实际练习试次</w:t>
             </w:r>
           </w:p>
         </w:tc>
@@ -187,7 +187,7 @@
           <w:tcPr/>
           <w:p>
             <w:r>
-              <w:t xml:space="preserve">0（无额外练习）</w:t>
+              <w:t xml:space="preserve">0 ⇒ **4**（兜底）</w:t>
             </w:r>
           </w:p>
         </w:tc>
@@ -324,12 +324,18 @@
         <w:t xml:space="preserve">被试间</w:t>
       </w:r>
       <w:r>
-        <w:t xml:space="preserve"> 4 组 = 0 / 8 / 32 / 120 个练习试次。</w:t>
-      </w:r>
-    </w:p>
-    <w:p>
-      <w:r>
-        <w:t xml:space="preserve">（所有被试都先做 60 s 联结学习 ⇒ P=0 不等于「零暴露」，它只是「没有额外练习」。）</w:t>
+        <w:t xml:space="preserve"> 4 组 = 0 / 8 / 32 / 120；</w:t>
+      </w:r>
+      <w:r>
+        <w:rPr>
+          <w:b/>
+        </w:rPr>
+        <w:t xml:space="preserve">实际练习试次 = `max(4, P)`</w:t>
+      </w:r>
+    </w:p>
+    <w:p>
+      <w:r>
+        <w:t xml:space="preserve">⇒ 组 1 也有 4 个兜底练习（不是「组 1 没有练习」，v2.8 更正）。 （所有被试都先做 60 s 联结学习 ⇒ P=0 不等于「零暴露」，它只是「没有额外练习」。）</w:t>
       </w:r>
     </w:p>
     <w:p>
@@ -437,7 +443,39 @@
       <w:ind w:left="360"/>
       •  
       <w:r>
-        <w:t xml:space="preserve">练习试次 = 本组的 P（组 1 没有练习，直接从联结学习进入正式）。</w:t>
+        <w:t xml:space="preserve">练习试次 = </w:t>
+      </w:r>
+      <w:r>
+        <w:rPr>
+          <w:rFonts w:ascii="Consolas" w:hAnsi="Consolas"/>
+        </w:rPr>
+        <w:t xml:space="preserve">max(4, 本组的 P)</w:t>
+      </w:r>
+      <w:r>
+        <w:t xml:space="preserve">：组 1 为 </w:t>
+      </w:r>
+      <w:r>
+        <w:rPr>
+          <w:b/>
+        </w:rPr>
+        <w:t xml:space="preserve">4 个兜底练习</w:t>
+      </w:r>
+      <w:r>
+        <w:t xml:space="preserve">（先走通一遍完整流程再进正式），</w:t>
+      </w:r>
+    </w:p>
+    <w:p>
+      <w:r>
+        <w:t xml:space="preserve">组 2/3/4 为 8 / 32 / 120。</w:t>
+      </w:r>
+      <w:r>
+        <w:rPr>
+          <w:rFonts w:ascii="Consolas" w:hAnsi="Consolas"/>
+        </w:rPr>
+        <w:t xml:space="preserve">P</w:t>
+      </w:r>
+      <w:r>
+        <w:t xml:space="preserve"> 仍是组参数，CSV 第 8 列组 1 写 0（练习行数与它不是同一个量）。</w:t>
       </w:r>
     </w:p>
     <w:p>
@@ -642,7 +680,7 @@
           <w:tcPr/>
           <w:p>
             <w:r>
-              <w:t xml:space="preserve">0</w:t>
+              <w:t xml:space="preserve">4（兜底）</w:t>
             </w:r>
           </w:p>
         </w:tc>
@@ -1631,7 +1669,7 @@
           <w:tcPr/>
           <w:p>
             <w:r>
-              <w:t xml:space="preserve">末行 `== 通过 32 / 未通过 0 ==`</w:t>
+              <w:t xml:space="preserve">末行 `== 通过 34 / 未通过 0 ==`</w:t>
             </w:r>
           </w:p>
         </w:tc>
@@ -2266,23 +2304,37 @@
     <w:p>
       <w:pStyle w:val="Heading3"/>
       <w:r>
-        <w:t xml:space="preserve">5.3 练习阶段（只有 P&gt;0 的组才有）</w:t>
-      </w:r>
-    </w:p>
-    <w:p>
-      <w:ind w:left="360"/>
-      •  
-      <w:r>
-        <w:t xml:space="preserve">组 2（P=8）有 8 个练习试次；组 3（P=32）有 32 个；组 4（P=120）有 120 个；</w:t>
-      </w:r>
-      <w:r>
-        <w:rPr>
-          <w:b/>
-        </w:rPr>
-        <w:t xml:space="preserve">组 1（P=0）没有练习</w:t>
-      </w:r>
-      <w:r>
-        <w:t xml:space="preserve">。</w:t>
+        <w:t xml:space="preserve">5.3 练习阶段（4–120 试次；组 1 为 4 个兜底）</w:t>
+      </w:r>
+    </w:p>
+    <w:p>
+      <w:ind w:left="360"/>
+      •  
+      <w:r>
+        <w:t xml:space="preserve">练习试次 = </w:t>
+      </w:r>
+      <w:r>
+        <w:rPr>
+          <w:rFonts w:ascii="Consolas" w:hAnsi="Consolas"/>
+        </w:rPr>
+        <w:t xml:space="preserve">max(4, P)</w:t>
+      </w:r>
+      <w:r>
+        <w:t xml:space="preserve">：组 1（P=0）</w:t>
+      </w:r>
+      <w:r>
+        <w:rPr>
+          <w:b/>
+        </w:rPr>
+        <w:t xml:space="preserve">4 个兜底</w:t>
+      </w:r>
+      <w:r>
+        <w:t xml:space="preserve">、组 2 为 8、组 3 为 32、组 4 为 120。</w:t>
+      </w:r>
+    </w:p>
+    <w:p>
+      <w:r>
+        <w:t xml:space="preserve">组 1 的这 4 个试次同样给正确/错误/过慢反馈，目的是让被试在正式前走通一遍完整流程。</w:t>
       </w:r>
     </w:p>
     <w:p>
@@ -2982,10 +3034,10 @@
         <w:rPr>
           <w:b/>
         </w:rPr>
-        <w:t xml:space="preserve">576 + P</w:t>
-      </w:r>
-      <w:r>
-        <w:t xml:space="preserve"> 行、txt 同量行。</w:t>
+        <w:t xml:space="preserve">576 + max(4, P)</w:t>
+      </w:r>
+      <w:r>
+        <w:t xml:space="preserve"> 行（组 1 = 580 行）、txt 同量行。</w:t>
       </w:r>
     </w:p>
     <w:p>
@@ -3235,7 +3287,7 @@
         <w:rPr>
           <w:b/>
         </w:rPr>
-        <w:t xml:space="preserve">怎么确认跑的是 v4.8</w:t>
+        <w:t xml:space="preserve">怎么确认跑的是 v4.9</w:t>
       </w:r>
       <w:r>
         <w:t xml:space="preserve">：</w:t>
@@ -3244,10 +3296,10 @@
         <w:rPr>
           <w:rFonts w:ascii="Consolas" w:hAnsi="Consolas"/>
         </w:rPr>
-        <w:t xml:space="preserve">type Exp_Design_Formal.m | findstr "v4.8"</w:t>
-      </w:r>
-      <w:r>
-        <w:t xml:space="preserve">，应打印 ★★ v4.8 本次修正 段头注。</w:t>
+        <w:t xml:space="preserve">type Exp_Design_Formal.m | findstr "v4.9"</w:t>
+      </w:r>
+      <w:r>
+        <w:t xml:space="preserve">，应打印 ★★ v4.9 本次修正 段头注。</w:t>
       </w:r>
     </w:p>
     <w:p>
@@ -3360,7 +3412,7 @@
         <w:rPr>
           <w:b/>
         </w:rPr>
-        <w:t xml:space="preserve">怎么确认跑的是 v4.8</w:t>
+        <w:t xml:space="preserve">怎么确认跑的是 v4.9</w:t>
       </w:r>
       <w:r>
         <w:t xml:space="preserve">：</w:t>
@@ -3369,10 +3421,10 @@
         <w:rPr>
           <w:rFonts w:ascii="Consolas" w:hAnsi="Consolas"/>
         </w:rPr>
-        <w:t xml:space="preserve">type Exp_Design_Formal.m | findstr "v4.8"</w:t>
-      </w:r>
-      <w:r>
-        <w:t xml:space="preserve">，应打印 ★★ v4.8 本次修正 段头注。</w:t>
+        <w:t xml:space="preserve">type Exp_Design_Formal.m | findstr "v4.9"</w:t>
+      </w:r>
+      <w:r>
+        <w:t xml:space="preserve">，应打印 ★★ v4.9 本次修正 段头注。</w:t>
       </w:r>
     </w:p>
     <w:p>
@@ -3595,7 +3647,25 @@
         <w:t xml:space="preserve">576</w:t>
       </w:r>
       <w:r>
-        <w:t xml:space="preserve">；练习行数 = P（组 1 应为 0 行练习）</w:t>
+        <w:t xml:space="preserve">；练习行数 = </w:t>
+      </w:r>
+      <w:r>
+        <w:rPr>
+          <w:rFonts w:ascii="Consolas" w:hAnsi="Consolas"/>
+        </w:rPr>
+        <w:t xml:space="preserve">max(4, P)</w:t>
+      </w:r>
+      <w:r>
+        <w:t xml:space="preserve">（组 1 应为 </w:t>
+      </w:r>
+      <w:r>
+        <w:rPr>
+          <w:b/>
+        </w:rPr>
+        <w:t xml:space="preserve">4</w:t>
+      </w:r>
+      <w:r>
+        <w:t xml:space="preserve"> 行练习，不是 0）</w:t>
       </w:r>
     </w:p>
     <w:p>

</xml_diff>